<commit_message>
Update Report 1 with user-run validation results
</commit_message>
<xml_diff>
--- a/reports/report1.docx
+++ b/reports/report1.docx
@@ -149,7 +149,7 @@
         <w:spacing w:after="60"/>
       </w:pPr>
       <w:r>
-        <w:t xml:space="preserve">Ran a short validation training job (2 epochs) to confirm the full pipeline works without errors.</w:t>
+        <w:t xml:space="preserve">Ran a short validation training job (2 epochs) to confirm the full pipeline works without errors, then independently re-ran it end-to-end (fresh data download included) to confirm the pipeline is reproducible.</w:t>
       </w:r>
     </w:p>
     <w:p>
@@ -181,7 +181,7 @@
       <w:pPr>
         <w:spacing w:after="160"/>
       </w:pPr>
-      <w:hyperlink w:history="1" r:id="rIdbwxs2dbucg260nwiez-gp">
+      <w:hyperlink w:history="1" r:id="rIdscvczcrunooayxohl3ewy">
         <w:r>
           <w:rPr>
             <w:rStyle w:val="Hyperlink"/>
@@ -199,7 +199,7 @@
           <w:b/>
           <w:bCs/>
         </w:rPr>
-        <w:t xml:space="preserve">Commit history (5 commits):</w:t>
+        <w:t xml:space="preserve">Commit history (7 commits):</w:t>
       </w:r>
     </w:p>
     <w:p>
@@ -212,7 +212,7 @@
           <w:sz w:val="20"/>
           <w:szCs w:val="20"/>
         </w:rPr>
-        <w:t xml:space="preserve">41aaed6  Add Checkpoint 1 validation training curve</w:t>
+        <w:t xml:space="preserve">bbfb081  Update Checkpoint 1 training curve with user-run results</w:t>
       </w:r>
     </w:p>
     <w:p>
@@ -225,7 +225,7 @@
           <w:sz w:val="20"/>
           <w:szCs w:val="20"/>
         </w:rPr>
-        <w:t xml:space="preserve">714e1eb  Add --device override flag; default num_workers to 0</w:t>
+        <w:t xml:space="preserve">fe75609  Add Report 1 draft (Foundation checkpoint)</w:t>
       </w:r>
     </w:p>
     <w:p>
@@ -238,7 +238,7 @@
           <w:sz w:val="20"/>
           <w:szCs w:val="20"/>
         </w:rPr>
-        <w:t xml:space="preserve">0df6abc  Remove assistant-facing notes from project plan</w:t>
+        <w:t xml:space="preserve">41aaed6  Add Checkpoint 1 validation training curve</w:t>
       </w:r>
     </w:p>
     <w:p>
@@ -251,7 +251,7 @@
           <w:sz w:val="20"/>
           <w:szCs w:val="20"/>
         </w:rPr>
-        <w:t xml:space="preserve">5cd6536  Add project plan, repo scaffolding, and CIFAR ResNet-18 training script</w:t>
+        <w:t xml:space="preserve">714e1eb  Add --device override flag; default num_workers to 0</w:t>
       </w:r>
     </w:p>
     <w:p>
@@ -264,6 +264,32 @@
           <w:sz w:val="20"/>
           <w:szCs w:val="20"/>
         </w:rPr>
+        <w:t xml:space="preserve">0df6abc  Remove assistant-facing notes from project plan</w:t>
+      </w:r>
+    </w:p>
+    <w:p>
+      <w:pPr>
+        <w:spacing w:after="40"/>
+      </w:pPr>
+      <w:r>
+        <w:rPr>
+          <w:rFonts w:ascii="Courier New" w:cs="Courier New" w:eastAsia="Courier New" w:hAnsi="Courier New"/>
+          <w:sz w:val="20"/>
+          <w:szCs w:val="20"/>
+        </w:rPr>
+        <w:t xml:space="preserve">5cd6536  Add project plan, repo scaffolding, and CIFAR ResNet-18 training script</w:t>
+      </w:r>
+    </w:p>
+    <w:p>
+      <w:pPr>
+        <w:spacing w:after="40"/>
+      </w:pPr>
+      <w:r>
+        <w:rPr>
+          <w:rFonts w:ascii="Courier New" w:cs="Courier New" w:eastAsia="Courier New" w:hAnsi="Courier New"/>
+          <w:sz w:val="20"/>
+          <w:szCs w:val="20"/>
+        </w:rPr>
         <w:t xml:space="preserve">1ab4e25  Initial commit</w:t>
       </w:r>
     </w:p>
@@ -276,7 +302,7 @@
           <w:b/>
           <w:bCs/>
         </w:rPr>
-        <w:t xml:space="preserve">Validation training run (2 epochs, CIFAR-10, ResNet-18):</w:t>
+        <w:t xml:space="preserve">Validation training run (2 epochs, CIFAR-10, ResNet-18), reproduced independently:</w:t>
       </w:r>
     </w:p>
     <w:tbl>
@@ -392,37 +418,37 @@
           </w:tcPr>
           <w:p>
             <w:r>
-              <w:t xml:space="preserve">1.3455</w:t>
-            </w:r>
-          </w:p>
-        </w:tc>
-        <w:tc>
-          <w:tcPr>
-            <w:tcW w:type="dxa" w:w="1950"/>
-          </w:tcPr>
-          <w:p>
-            <w:r>
-              <w:t xml:space="preserve">0.5095</w:t>
-            </w:r>
-          </w:p>
-        </w:tc>
-        <w:tc>
-          <w:tcPr>
-            <w:tcW w:type="dxa" w:w="1950"/>
-          </w:tcPr>
-          <w:p>
-            <w:r>
-              <w:t xml:space="preserve">1.2113</w:t>
-            </w:r>
-          </w:p>
-        </w:tc>
-        <w:tc>
-          <w:tcPr>
-            <w:tcW w:type="dxa" w:w="1950"/>
-          </w:tcPr>
-          <w:p>
-            <w:r>
-              <w:t xml:space="preserve">0.5729</w:t>
+              <w:t xml:space="preserve">1.3787</w:t>
+            </w:r>
+          </w:p>
+        </w:tc>
+        <w:tc>
+          <w:tcPr>
+            <w:tcW w:type="dxa" w:w="1950"/>
+          </w:tcPr>
+          <w:p>
+            <w:r>
+              <w:t xml:space="preserve">0.4967</w:t>
+            </w:r>
+          </w:p>
+        </w:tc>
+        <w:tc>
+          <w:tcPr>
+            <w:tcW w:type="dxa" w:w="1950"/>
+          </w:tcPr>
+          <w:p>
+            <w:r>
+              <w:t xml:space="preserve">1.0773</w:t>
+            </w:r>
+          </w:p>
+        </w:tc>
+        <w:tc>
+          <w:tcPr>
+            <w:tcW w:type="dxa" w:w="1950"/>
+          </w:tcPr>
+          <w:p>
+            <w:r>
+              <w:t xml:space="preserve">0.6190</w:t>
             </w:r>
           </w:p>
         </w:tc>
@@ -444,37 +470,37 @@
           </w:tcPr>
           <w:p>
             <w:r>
-              <w:t xml:space="preserve">0.8884</w:t>
-            </w:r>
-          </w:p>
-        </w:tc>
-        <w:tc>
-          <w:tcPr>
-            <w:tcW w:type="dxa" w:w="1950"/>
-          </w:tcPr>
-          <w:p>
-            <w:r>
-              <w:t xml:space="preserve">0.6846</w:t>
-            </w:r>
-          </w:p>
-        </w:tc>
-        <w:tc>
-          <w:tcPr>
-            <w:tcW w:type="dxa" w:w="1950"/>
-          </w:tcPr>
-          <w:p>
-            <w:r>
-              <w:t xml:space="preserve">0.8745</w:t>
-            </w:r>
-          </w:p>
-        </w:tc>
-        <w:tc>
-          <w:tcPr>
-            <w:tcW w:type="dxa" w:w="1950"/>
-          </w:tcPr>
-          <w:p>
-            <w:r>
-              <w:t xml:space="preserve">0.7040</w:t>
+              <w:t xml:space="preserve">0.8976</w:t>
+            </w:r>
+          </w:p>
+        </w:tc>
+        <w:tc>
+          <w:tcPr>
+            <w:tcW w:type="dxa" w:w="1950"/>
+          </w:tcPr>
+          <w:p>
+            <w:r>
+              <w:t xml:space="preserve">0.6814</w:t>
+            </w:r>
+          </w:p>
+        </w:tc>
+        <w:tc>
+          <w:tcPr>
+            <w:tcW w:type="dxa" w:w="1950"/>
+          </w:tcPr>
+          <w:p>
+            <w:r>
+              <w:t xml:space="preserve">0.8519</w:t>
+            </w:r>
+          </w:p>
+        </w:tc>
+        <w:tc>
+          <w:tcPr>
+            <w:tcW w:type="dxa" w:w="1950"/>
+          </w:tcPr>
+          <w:p>
+            <w:r>
+              <w:t xml:space="preserve">0.7168</w:t>
             </w:r>
           </w:p>
         </w:tc>
@@ -493,7 +519,7 @@
         <w:spacing w:after="120"/>
       </w:pPr>
       <w:r>
-        <w:t xml:space="preserve">Test accuracy reached 70.4% after only 2 epochs (well above the 10% random-guess baseline for 10 classes), with loss decreasing and accuracy rising smoothly across both epochs — confirming the data pipeline, augmentation, model, optimizer, and checkpointing all function correctly together. This is a short sanity run, not the full training job; Checkpoint 2 will run to convergence to reach the 85–93% target range.</w:t>
+        <w:t xml:space="preserve">Test accuracy reached 71.7% after only 2 epochs (well above the 10% random-guess baseline for 10 classes), with loss decreasing and accuracy rising smoothly across both epochs — confirming the data pipeline, augmentation, model, optimizer, and checkpointing all function correctly together. This run was executed independently end-to-end (including a fresh CIFAR-10 download) to confirm the pipeline is reproducible, not just a one-off result. This is a short sanity run, not the full training job; Checkpoint 2 will run to convergence to reach the 85–93% target range.</w:t>
       </w:r>
     </w:p>
     <w:p>

</xml_diff>